<commit_message>
Week 8, made a backend testing file and fixed some errors in the documents
</commit_message>
<xml_diff>
--- a/docs/Milestone 1 Project Foundation/MIS3371-Requirements.docx
+++ b/docs/Milestone 1 Project Foundation/MIS3371-Requirements.docx
@@ -136,7 +136,19 @@
           <w:p/>
           <w:p>
             <w:r>
-              <w:t>The system shall allow the user to receive points from each qualifying purchase. (EX: $1=1 point)</w:t>
+              <w:t>The system shall allow the user to receive points from each qualifying purchase. (EX: $</w:t>
+            </w:r>
+            <w:r>
+              <w:t>0.</w:t>
+            </w:r>
+            <w:r>
+              <w:t>1</w:t>
+            </w:r>
+            <w:r>
+              <w:t>0</w:t>
+            </w:r>
+            <w:r>
+              <w:t>=1 point)</w:t>
             </w:r>
           </w:p>
           <w:p/>
@@ -352,15 +364,7 @@
           <w:p/>
           <w:p>
             <w:r>
-              <w:t xml:space="preserve">The system </w:t>
-            </w:r>
-            <w:proofErr w:type="gramStart"/>
-            <w:r>
-              <w:t>shall</w:t>
-            </w:r>
-            <w:proofErr w:type="gramEnd"/>
-            <w:r>
-              <w:t xml:space="preserve"> provide a real-time accurate display of the customer’s current point balance. </w:t>
+              <w:t xml:space="preserve">The system shall provide a real-time accurate display of the customer’s current point balance. </w:t>
             </w:r>
           </w:p>
           <w:p/>
@@ -437,15 +441,7 @@
           <w:p/>
           <w:p>
             <w:r>
-              <w:t xml:space="preserve">The system shall confirm with user if they’d like to redeem any eligible points before </w:t>
-            </w:r>
-            <w:proofErr w:type="gramStart"/>
-            <w:r>
-              <w:t>check</w:t>
-            </w:r>
-            <w:proofErr w:type="gramEnd"/>
-            <w:r>
-              <w:t xml:space="preserve"> out in order to encourage points usage and encourage usage. </w:t>
+              <w:t xml:space="preserve">The system shall confirm with user if they’d like to redeem any eligible points before check out in order to encourage points usage and encourage usage. </w:t>
             </w:r>
           </w:p>
           <w:p/>
@@ -1846,6 +1842,7 @@
   <w:style w:type="character" w:default="1" w:styleId="DefaultParagraphFont">
     <w:name w:val="Default Paragraph Font"/>
     <w:uiPriority w:val="1"/>
+    <w:semiHidden/>
     <w:unhideWhenUsed/>
   </w:style>
   <w:style w:type="table" w:default="1" w:styleId="TableNormal">

</xml_diff>